<commit_message>
update py and docx
</commit_message>
<xml_diff>
--- a/docs/Blackwell_Game_Addition/Different_RL_implementations_playing_Blackwell_game_Addition.docx
+++ b/docs/Blackwell_Game_Addition/Different_RL_implementations_playing_Blackwell_game_Addition.docx
@@ -3954,7 +3954,7 @@
           <w:sz w:val="20"/>
           <w:szCs w:val="20"/>
         </w:rPr>
-        <w:t xml:space="preserve">Further inspection of (bell.1) reveals that the optimal play for both sides can be computed by backward induction through the </w:t>
+        <w:t xml:space="preserve">Further inspection of (bell.1) reveals that the optimal play for both sides can be computed by </w:t>
       </w:r>
       <w:r>
         <w:rPr>
@@ -3963,21 +3963,66 @@
           <w:sz w:val="20"/>
           <w:szCs w:val="20"/>
         </w:rPr>
-        <w:t>game tree</w:t>
+        <w:t>backward induction</w:t>
       </w:r>
       <w:r>
         <w:rPr>
           <w:sz w:val="20"/>
           <w:szCs w:val="20"/>
         </w:rPr>
-        <w:t>. In the undiscounted , terminal reward – only case (like Tic-Tac-Toe</w:t>
-      </w:r>
-      <w:r>
-        <w:rPr>
+        <w:t xml:space="preserve"> through the </w:t>
+      </w:r>
+      <w:r>
+        <w:rPr>
+          <w:i/>
+          <w:iCs/>
           <w:sz w:val="20"/>
           <w:szCs w:val="20"/>
         </w:rPr>
-        <w:t xml:space="preserve"> or Addition), this simplifies to the recursive minimax definition in (minimax.1).</w:t>
+        <w:t>game tree</w:t>
+      </w:r>
+      <w:r>
+        <w:rPr>
+          <w:sz w:val="20"/>
+          <w:szCs w:val="20"/>
+        </w:rPr>
+        <w:t xml:space="preserve">. In the undiscounted , terminal reward – only case (like </w:t>
+      </w:r>
+      <w:r>
+        <w:rPr>
+          <w:b/>
+          <w:bCs/>
+          <w:i/>
+          <w:iCs/>
+          <w:sz w:val="20"/>
+          <w:szCs w:val="20"/>
+        </w:rPr>
+        <w:t>Tic-Tac-Toe</w:t>
+      </w:r>
+      <w:r>
+        <w:rPr>
+          <w:sz w:val="20"/>
+          <w:szCs w:val="20"/>
+        </w:rPr>
+        <w:t xml:space="preserve"> or </w:t>
+      </w:r>
+      <w:r>
+        <w:rPr>
+          <w:b/>
+          <w:bCs/>
+          <w:i/>
+          <w:iCs/>
+          <w:sz w:val="20"/>
+          <w:szCs w:val="20"/>
+        </w:rPr>
+        <w:t>Addition</w:t>
+      </w:r>
+      <w:r>
+        <w:rPr>
+          <w:sz w:val="20"/>
+          <w:szCs w:val="20"/>
+        </w:rPr>
+        <w:t>), this simplifies to the recursive minimax definition in (minimax.1).</w:t>
       </w:r>
     </w:p>
     <w:p>
@@ -3990,19 +4035,14 @@
     </w:p>
     <w:p>
       <w:pPr>
-        <w:rPr>
-          <w:sz w:val="20"/>
-          <w:szCs w:val="20"/>
-        </w:rPr>
+        <w:pStyle w:val="Heading2"/>
       </w:pPr>
       <w:r>
-        <w:rPr>
-          <w:sz w:val="20"/>
-          <w:szCs w:val="20"/>
-        </w:rPr>
         <w:t>Alpha-Beta Pruning</w:t>
       </w:r>
     </w:p>
+    <w:p/>
+    <w:p/>
     <w:p>
       <w:pPr>
         <w:rPr>
@@ -4085,6 +4125,50 @@
           <w:t>Dynamic Programming: Models and Applications, Eric Denardo, 1982, Yale U</w:t>
         </w:r>
       </w:hyperlink>
+    </w:p>
+    <w:p>
+      <w:r>
+        <w:t xml:space="preserve">[5] </w:t>
+      </w:r>
+      <w:hyperlink r:id="rId9" w:history="1">
+        <w:r>
+          <w:rPr>
+            <w:rStyle w:val="Hyperlink"/>
+          </w:rPr>
+          <w:t>src/minimax/game_addition_demo.py</w:t>
+        </w:r>
+      </w:hyperlink>
+    </w:p>
+    <w:p>
+      <w:r>
+        <w:t xml:space="preserve">[6] </w:t>
+      </w:r>
+      <w:hyperlink r:id="rId10" w:history="1">
+        <w:r>
+          <w:rPr>
+            <w:rStyle w:val="Hyperlink"/>
+          </w:rPr>
+          <w:t>src/minimax/tic-tac-toe_demo.py</w:t>
+        </w:r>
+      </w:hyperlink>
+    </w:p>
+    <w:p/>
+    <w:p>
+      <w:pPr>
+        <w:pStyle w:val="Heading1"/>
+      </w:pPr>
+      <w:r>
+        <w:t>Appendix</w:t>
+      </w:r>
+    </w:p>
+    <w:p/>
+    <w:p>
+      <w:pPr>
+        <w:pStyle w:val="Heading2"/>
+      </w:pPr>
+      <w:r>
+        <w:t>Applying Bellman’s equation and the minimax principle to the game tic-tac-toe</w:t>
+      </w:r>
     </w:p>
     <w:p/>
     <w:p/>
@@ -4533,7 +4617,6 @@
     <w:next w:val="Normal"/>
     <w:link w:val="Heading2Char"/>
     <w:uiPriority w:val="9"/>
-    <w:semiHidden/>
     <w:unhideWhenUsed/>
     <w:qFormat/>
     <w:rsid w:val="004A6719"/>
@@ -4747,7 +4830,6 @@
     <w:basedOn w:val="DefaultParagraphFont"/>
     <w:link w:val="Heading2"/>
     <w:uiPriority w:val="9"/>
-    <w:semiHidden/>
     <w:rsid w:val="004A6719"/>
     <w:rPr>
       <w:rFonts w:ascii="Calibri Light" w:eastAsiaTheme="majorEastAsia" w:hAnsi="Calibri Light" w:cstheme="majorBidi"/>

</xml_diff>